<commit_message>
Fix formula and equations format errors. Remove unescessary folders
</commit_message>
<xml_diff>
--- a/output/paper/real_time_memory_aware_qddca.docx
+++ b/output/paper/real_time_memory_aware_qddca.docx
@@ -53,6 +53,7 @@
       <w:pPr>
         <w:sectPr>
           <w:headerReference w:type="default" r:id="rId9"/>
+          <w:headerReference w:type="even" r:id="rId13"/>
           <w:footerReference w:type="default" r:id="rId10"/>
           <w:pgSz w:w="12240" w:h="15840"/>
           <w:pgMar w:top="893" w:right="936" w:bottom="893" w:left="936" w:header="403" w:footer="432" w:gutter="0"/>
@@ -319,18 +320,79 @@
       <w:pPr>
         <w:keepNext w:val="0"/>
         <w:keepLines/>
-        <w:spacing w:before="40" w:after="60" w:line="240" w:lineRule="auto"/>
-        <w:jc w:val="center"/>
+        <w:tabs>
+          <w:tab w:pos="2412" w:val="center"/>
+          <w:tab w:pos="4752" w:val="right"/>
+        </w:tabs>
+        <w:spacing w:before="40" w:after="80" w:line="240" w:lineRule="auto"/>
+        <w:ind w:firstLine="0" w:left="0" w:right="0"/>
+        <w:jc w:val="left"/>
       </w:pPr>
       <w:r>
+        <w:tab/>
+      </w:r>
+      <m:oMath>
+        <m:sSub>
+          <m:e>
+            <m:r>
+              <m:t>q</m:t>
+            </m:r>
+          </m:e>
+          <m:sub>
+            <m:r>
+              <m:rPr>
+                <m:nor/>
+              </m:rPr>
+              <m:t>hist</m:t>
+            </m:r>
+          </m:sub>
+        </m:sSub>
+        <m:r>
+          <m:t>(v)=</m:t>
+        </m:r>
+        <m:f>
+          <m:fPr>
+            <m:type m:val="bar"/>
+          </m:fPr>
+          <m:num>
+            <m:sSub>
+              <m:e>
+                <m:r>
+                  <m:t>n</m:t>
+                </m:r>
+              </m:e>
+              <m:sub>
+                <m:r>
+                  <m:t>s</m:t>
+                </m:r>
+              </m:sub>
+            </m:sSub>
+            <m:r>
+              <m:t>(v)+δ</m:t>
+            </m:r>
+          </m:num>
+          <m:den>
+            <m:r>
+              <m:t>n(v)+δ</m:t>
+            </m:r>
+          </m:den>
+        </m:f>
+        <m:r>
+          <m:t>,</m:t>
+        </m:r>
+        <m:r>
+          <m:t>δ=0.5.</m:t>
+        </m:r>
+      </m:oMath>
+      <w:r>
+        <w:tab/>
+      </w:r>
+      <w:r>
         <w:rPr>
-          <w:rFonts w:ascii="Times New Roman" w:hAnsi="Times New Roman" w:eastAsia="Times New Roman"/>
-          <w:i/>
-          <w:smallCaps w:val="0"/>
-          <w:color w:val="000000"/>
+          <w:rFonts w:ascii="Times New Roman" w:hAnsi="Times New Roman"/>
           <w:sz w:val="18"/>
         </w:rPr>
-        <w:t>q_hist(v) = [n_s(v) + delta] / [n(v) + delta],  delta = 0.5.     (1)</w:t>
+        <w:t>(1)</w:t>
       </w:r>
     </w:p>
     <w:p>
@@ -351,18 +413,97 @@
       <w:pPr>
         <w:keepNext w:val="0"/>
         <w:keepLines/>
-        <w:spacing w:before="40" w:after="60" w:line="240" w:lineRule="auto"/>
-        <w:jc w:val="center"/>
+        <w:tabs>
+          <w:tab w:pos="2412" w:val="center"/>
+          <w:tab w:pos="4752" w:val="right"/>
+        </w:tabs>
+        <w:spacing w:before="40" w:after="80" w:line="240" w:lineRule="auto"/>
+        <w:ind w:firstLine="0" w:left="0" w:right="0"/>
+        <w:jc w:val="left"/>
       </w:pPr>
       <w:r>
+        <w:tab/>
+      </w:r>
+      <m:oMath>
+        <m:sSub>
+          <m:e>
+            <m:r>
+              <m:t>u</m:t>
+            </m:r>
+          </m:e>
+          <m:sub>
+            <m:r>
+              <m:t>v</m:t>
+            </m:r>
+          </m:sub>
+        </m:sSub>
+        <m:r>
+          <m:t>=</m:t>
+        </m:r>
+        <m:r>
+          <m:rPr>
+            <m:nor/>
+          </m:rPr>
+          <m:t>min</m:t>
+        </m:r>
+        <m:r>
+          <m:t>{1,</m:t>
+        </m:r>
+        <m:r>
+          <m:rPr>
+            <m:nor/>
+          </m:rPr>
+          <m:t>max</m:t>
+        </m:r>
+        <m:r>
+          <m:t>{0,</m:t>
+        </m:r>
+        <m:f>
+          <m:fPr>
+            <m:type m:val="bar"/>
+          </m:fPr>
+          <m:num>
+            <m:sSub>
+              <m:e>
+                <m:r>
+                  <m:t>c</m:t>
+                </m:r>
+              </m:e>
+              <m:sub>
+                <m:r>
+                  <m:t>v</m:t>
+                </m:r>
+              </m:sub>
+            </m:sSub>
+          </m:num>
+          <m:den>
+            <m:sSub>
+              <m:e>
+                <m:r>
+                  <m:t>C</m:t>
+                </m:r>
+              </m:e>
+              <m:sub>
+                <m:r>
+                  <m:t>v</m:t>
+                </m:r>
+              </m:sub>
+            </m:sSub>
+          </m:den>
+        </m:f>
+        <m:r>
+          <m:t>}}.</m:t>
+        </m:r>
+      </m:oMath>
+      <w:r>
+        <w:tab/>
+      </w:r>
+      <w:r>
         <w:rPr>
-          <w:rFonts w:ascii="Times New Roman" w:hAnsi="Times New Roman" w:eastAsia="Times New Roman"/>
-          <w:i/>
-          <w:smallCaps w:val="0"/>
-          <w:color w:val="000000"/>
+          <w:rFonts w:ascii="Times New Roman" w:hAnsi="Times New Roman"/>
           <w:sz w:val="18"/>
         </w:rPr>
-        <w:t>u_v = min(1, max(0, c_v / C_v)).                                      (2)</w:t>
+        <w:t>(2)</w:t>
       </w:r>
     </w:p>
     <w:p>
@@ -383,18 +524,74 @@
       <w:pPr>
         <w:keepNext w:val="0"/>
         <w:keepLines/>
-        <w:spacing w:before="40" w:after="60" w:line="240" w:lineRule="auto"/>
-        <w:jc w:val="center"/>
+        <w:tabs>
+          <w:tab w:pos="2412" w:val="center"/>
+          <w:tab w:pos="4752" w:val="right"/>
+        </w:tabs>
+        <w:spacing w:before="40" w:after="80" w:line="240" w:lineRule="auto"/>
+        <w:ind w:firstLine="0" w:left="0" w:right="0"/>
+        <w:jc w:val="left"/>
       </w:pPr>
       <w:r>
+        <w:tab/>
+      </w:r>
+      <m:oMath>
+        <m:acc>
+          <m:accPr>
+            <m:chr m:val="̂"/>
+          </m:accPr>
+          <m:e>
+            <m:r>
+              <m:t>q</m:t>
+            </m:r>
+          </m:e>
+        </m:acc>
+        <m:r>
+          <m:t>(v)=α</m:t>
+        </m:r>
+        <m:sSub>
+          <m:e>
+            <m:r>
+              <m:t>q</m:t>
+            </m:r>
+          </m:e>
+          <m:sub>
+            <m:r>
+              <m:rPr>
+                <m:nor/>
+              </m:rPr>
+              <m:t>hist</m:t>
+            </m:r>
+          </m:sub>
+        </m:sSub>
+        <m:r>
+          <m:t>(v)+(1-α)(1-</m:t>
+        </m:r>
+        <m:sSub>
+          <m:e>
+            <m:r>
+              <m:t>u</m:t>
+            </m:r>
+          </m:e>
+          <m:sub>
+            <m:r>
+              <m:t>v</m:t>
+            </m:r>
+          </m:sub>
+        </m:sSub>
+        <m:r>
+          <m:t>).</m:t>
+        </m:r>
+      </m:oMath>
+      <w:r>
+        <w:tab/>
+      </w:r>
+      <w:r>
         <w:rPr>
-          <w:rFonts w:ascii="Times New Roman" w:hAnsi="Times New Roman" w:eastAsia="Times New Roman"/>
-          <w:i/>
-          <w:smallCaps w:val="0"/>
-          <w:color w:val="000000"/>
+          <w:rFonts w:ascii="Times New Roman" w:hAnsi="Times New Roman"/>
           <w:sz w:val="18"/>
         </w:rPr>
-        <w:t>q_hat(v) = alpha q_hist(v) + (1 - alpha)(1 - u_v).                (3)</w:t>
+        <w:t>(3)</w:t>
       </w:r>
     </w:p>
     <w:p>
@@ -445,18 +642,161 @@
       <w:pPr>
         <w:keepNext w:val="0"/>
         <w:keepLines/>
-        <w:spacing w:before="40" w:after="60" w:line="240" w:lineRule="auto"/>
-        <w:jc w:val="center"/>
+        <w:tabs>
+          <w:tab w:pos="2412" w:val="center"/>
+          <w:tab w:pos="4752" w:val="right"/>
+        </w:tabs>
+        <w:spacing w:before="40" w:after="80" w:line="240" w:lineRule="auto"/>
+        <w:ind w:firstLine="0" w:left="0" w:right="0"/>
+        <w:jc w:val="left"/>
       </w:pPr>
       <w:r>
+        <w:tab/>
+      </w:r>
+      <m:oMath>
+        <m:sSub>
+          <m:e>
+            <m:r>
+              <m:t>y</m:t>
+            </m:r>
+          </m:e>
+          <m:sub>
+            <m:r>
+              <m:t>v</m:t>
+            </m:r>
+          </m:sub>
+        </m:sSub>
+        <m:r>
+          <m:t>=[1-</m:t>
+        </m:r>
+        <m:sSup>
+          <m:e>
+            <m:d>
+              <m:dPr>
+                <m:sepChr m:val=""/>
+              </m:dPr>
+              <m:e>
+                <m:r>
+                  <m:t>1</m:t>
+                </m:r>
+                <m:r>
+                  <m:t>-</m:t>
+                </m:r>
+                <m:acc>
+                  <m:accPr>
+                    <m:chr m:val="̂"/>
+                  </m:accPr>
+                  <m:e>
+                    <m:r>
+                      <m:t>q</m:t>
+                    </m:r>
+                  </m:e>
+                </m:acc>
+                <m:r>
+                  <m:t>(</m:t>
+                </m:r>
+                <m:r>
+                  <m:t>v</m:t>
+                </m:r>
+                <m:r>
+                  <m:t>)</m:t>
+                </m:r>
+              </m:e>
+            </m:d>
+          </m:e>
+          <m:sup>
+            <m:r>
+              <m:t>M-m</m:t>
+            </m:r>
+          </m:sup>
+        </m:sSup>
+        <m:r>
+          <m:t>]</m:t>
+        </m:r>
+        <m:sSub>
+          <m:e>
+            <m:r>
+              <m:t>d</m:t>
+            </m:r>
+          </m:e>
+          <m:sub>
+            <m:r>
+              <m:t>v</m:t>
+            </m:r>
+          </m:sub>
+        </m:sSub>
+        <m:r>
+          <m:t>+</m:t>
+        </m:r>
+        <m:sSup>
+          <m:e>
+            <m:d>
+              <m:dPr>
+                <m:sepChr m:val=""/>
+              </m:dPr>
+              <m:e>
+                <m:r>
+                  <m:t>1</m:t>
+                </m:r>
+                <m:r>
+                  <m:t>-</m:t>
+                </m:r>
+                <m:acc>
+                  <m:accPr>
+                    <m:chr m:val="̂"/>
+                  </m:accPr>
+                  <m:e>
+                    <m:r>
+                      <m:t>q</m:t>
+                    </m:r>
+                  </m:e>
+                </m:acc>
+                <m:r>
+                  <m:t>(</m:t>
+                </m:r>
+                <m:r>
+                  <m:t>v</m:t>
+                </m:r>
+                <m:r>
+                  <m:t>)</m:t>
+                </m:r>
+              </m:e>
+            </m:d>
+          </m:e>
+          <m:sup>
+            <m:r>
+              <m:t>M-m</m:t>
+            </m:r>
+          </m:sup>
+        </m:sSup>
+        <m:sSub>
+          <m:e>
+            <m:r>
+              <m:t>C</m:t>
+            </m:r>
+          </m:e>
+          <m:sub>
+            <m:r>
+              <m:rPr>
+                <m:nor/>
+              </m:rPr>
+              <m:t>drop</m:t>
+            </m:r>
+          </m:sub>
+        </m:sSub>
+        <m:r>
+          <m:t>.</m:t>
+        </m:r>
+      </m:oMath>
+      <w:r>
+        <w:tab/>
+      </w:r>
+      <w:r>
         <w:rPr>
-          <w:rFonts w:ascii="Times New Roman" w:hAnsi="Times New Roman" w:eastAsia="Times New Roman"/>
-          <w:i/>
-          <w:smallCaps w:val="0"/>
-          <w:color w:val="000000"/>
+          <w:rFonts w:ascii="Times New Roman" w:hAnsi="Times New Roman"/>
           <w:sz w:val="18"/>
         </w:rPr>
-        <w:t>y_v = [1 - (1 - q_hat(v))^(M-m)] d_v + (1 - q_hat(v))^(M-m) C_drop.      (4)</w:t>
+        <w:t>(4)</w:t>
       </w:r>
     </w:p>
     <w:p>
@@ -1694,6 +2034,9 @@
       </w:r>
     </w:p>
     <w:sectPr>
+      <w:headerReference w:type="default" r:id="rId9"/>
+      <w:headerReference w:type="even" r:id="rId13"/>
+      <w:footerReference w:type="default" r:id="rId10"/>
       <w:type w:val="continuous"/>
       <w:pgSz w:w="12240" w:h="15840"/>
       <w:pgMar w:top="893" w:right="936" w:bottom="893" w:left="936" w:header="403" w:footer="432" w:gutter="0"/>
@@ -1818,6 +2161,42 @@
       </w:tc>
     </w:tr>
   </w:tbl>
+</w:hdr>
+</file>
+
+<file path=word/header2.xml><?xml version="1.0" encoding="utf-8"?>
+<w:hdr xmlns:m="http://schemas.openxmlformats.org/officeDocument/2006/math" xmlns:mc="http://schemas.openxmlformats.org/markup-compatibility/2006" xmlns:mo="http://schemas.microsoft.com/office/mac/office/2008/main" xmlns:mv="urn:schemas-microsoft-com:mac:vml" xmlns:o="urn:schemas-microsoft-com:office:office" xmlns:r="http://schemas.openxmlformats.org/officeDocument/2006/relationships" xmlns:v="urn:schemas-microsoft-com:vml" xmlns:w10="urn:schemas-microsoft-com:office:word" xmlns:w14="http://schemas.microsoft.com/office/word/2010/wordml" xmlns:w="http://schemas.openxmlformats.org/wordprocessingml/2006/main" xmlns:wne="http://schemas.microsoft.com/office/word/2006/wordml" xmlns:wp14="http://schemas.microsoft.com/office/word/2010/wordprocessingDrawing" xmlns:wp="http://schemas.openxmlformats.org/drawingml/2006/wordprocessingDrawing" xmlns:wpc="http://schemas.microsoft.com/office/word/2010/wordprocessingCanvas" xmlns:wpg="http://schemas.microsoft.com/office/word/2010/wordprocessingGroup" xmlns:wpi="http://schemas.microsoft.com/office/word/2010/wordprocessingInk" xmlns:wps="http://schemas.microsoft.com/office/word/2010/wordprocessingShape" mc:Ignorable="w14 wp14">
+  <w:p>
+    <w:pPr>
+      <w:tabs>
+        <w:tab w:pos="10296" w:val="right"/>
+      </w:tabs>
+      <w:spacing w:before="0" w:after="0" w:line="240" w:lineRule="auto"/>
+      <w:jc w:val="left"/>
+    </w:pPr>
+    <w:r>
+      <w:rPr>
+        <w:rFonts w:ascii="Times New Roman" w:hAnsi="Times New Roman"/>
+        <w:smallCaps/>
+        <w:sz w:val="15"/>
+      </w:rPr>
+      <w:t>PREPRINT - Q-DDCA MEMORY-AWARE EXTENSION</w:t>
+    </w:r>
+    <w:r>
+      <w:tab/>
+    </w:r>
+    <w:r>
+      <w:rPr>
+        <w:rFonts w:ascii="Times New Roman" w:hAnsi="Times New Roman"/>
+        <w:sz w:val="15"/>
+      </w:rPr>
+      <w:fldChar w:fldCharType="begin"/>
+      <w:instrText xml:space="preserve"> PAGE </w:instrText>
+      <w:fldChar w:fldCharType="separate"/>
+      <w:t>2</w:t>
+      <w:fldChar w:fldCharType="end"/>
+    </w:r>
+  </w:p>
 </w:hdr>
 </file>
 

</xml_diff>